<commit_message>
Add CI screenshot and final report
</commit_message>
<xml_diff>
--- a/reports/report.docx
+++ b/reports/report.docx
@@ -47,7 +47,7 @@
         <w:t xml:space="preserve">Repository: </w:t>
       </w:r>
       <w:r>
-        <w:t>&lt;GitHub repository URL - to be added after the first push&gt;</w:t>
+        <w:t>https://github.com/2025ae05879/mlops-heart-disease</w:t>
       </w:r>
     </w:p>
     <w:p>
@@ -2338,51 +2338,63 @@
         <w:rPr>
           <w:b/>
         </w:rPr>
-        <w:t xml:space="preserve">Status, stated honestly: </w:t>
+        <w:t xml:space="preserve">Status: </w:t>
       </w:r>
       <w:r>
-        <w:t>The workflow is written and every step has been run locally, but it has not yet run on GitHub. git was not installed on the development laptop when this report was built, and the repository has not been pushed. The screenshot below will be added after the first push.</w:t>
+        <w:t>The workflow ran on GitHub after the push (run #2, job lint-test-train) and passed in 1m 52s with one uploaded artifact.</w:t>
       </w:r>
     </w:p>
-    <w:tbl>
-      <w:tblPr>
-        <w:tblStyle w:val="TableGrid"/>
-        <w:tblW w:type="auto" w:w="0"/>
+    <w:p>
+      <w:pPr>
         <w:jc w:val="center"/>
-        <w:tblLook w:firstColumn="1" w:firstRow="1" w:lastColumn="0" w:lastRow="0" w:noHBand="0" w:noVBand="1" w:val="04A0"/>
-      </w:tblPr>
-      <w:tblGrid>
-        <w:gridCol w:w="9746"/>
-      </w:tblGrid>
-      <w:tr>
-        <w:tc>
-          <w:tcPr>
-            <w:tcW w:type="dxa" w:w="9746"/>
-            <w:shd w:val="clear" w:color="auto" w:fill="FFF4CE"/>
-          </w:tcPr>
-          <w:p>
-            <w:r>
-              <w:rPr>
-                <w:b/>
-                <w:color w:val="9C5700"/>
-              </w:rPr>
-              <w:t>SCREENSHOT PLACEHOLDER - screenshots/05_ci_github_actions.png</w:t>
-            </w:r>
-          </w:p>
-          <w:p>
-            <w:r>
-              <w:t>To capture: GitHub Actions run page for ci.yml with all steps green and the uploaded artifact listed</w:t>
-            </w:r>
-          </w:p>
-          <w:p>
-            <w:r>
-              <w:t>Save the image under that exact name and re-run `python scripts/build_report.py`.</w:t>
-            </w:r>
-          </w:p>
-        </w:tc>
-      </w:tr>
-    </w:tbl>
-    <w:p/>
+      </w:pPr>
+      <w:r>
+        <w:drawing>
+          <wp:inline xmlns:a="http://schemas.openxmlformats.org/drawingml/2006/main" xmlns:pic="http://schemas.openxmlformats.org/drawingml/2006/picture">
+            <wp:extent cx="5580000" cy="2688626"/>
+            <wp:docPr id="10" name="Picture 10"/>
+            <wp:cNvGraphicFramePr>
+              <a:graphicFrameLocks noChangeAspect="1"/>
+            </wp:cNvGraphicFramePr>
+            <a:graphic>
+              <a:graphicData uri="http://schemas.openxmlformats.org/drawingml/2006/picture">
+                <pic:pic>
+                  <pic:nvPicPr>
+                    <pic:cNvPr id="0" name="05_ci_github_actions.png"/>
+                    <pic:cNvPicPr/>
+                  </pic:nvPicPr>
+                  <pic:blipFill>
+                    <a:blip r:embed="rId18"/>
+                    <a:stretch>
+                      <a:fillRect/>
+                    </a:stretch>
+                  </pic:blipFill>
+                  <pic:spPr>
+                    <a:xfrm>
+                      <a:off x="0" y="0"/>
+                      <a:ext cx="5580000" cy="2688626"/>
+                    </a:xfrm>
+                    <a:prstGeom prst="rect"/>
+                  </pic:spPr>
+                </pic:pic>
+              </a:graphicData>
+            </a:graphic>
+          </wp:inline>
+        </w:drawing>
+      </w:r>
+    </w:p>
+    <w:p>
+      <w:pPr>
+        <w:jc w:val="center"/>
+      </w:pPr>
+      <w:r>
+        <w:rPr>
+          <w:i/>
+          <w:sz w:val="18"/>
+        </w:rPr>
+        <w:t>Figure 10. Screenshot - GitHub Actions run page for ci.yml with all steps green and the uploaded artifact listed</w:t>
+      </w:r>
+    </w:p>
     <w:p>
       <w:pPr>
         <w:pStyle w:val="Heading1"/>
@@ -2427,7 +2439,7 @@
         <w:drawing>
           <wp:inline xmlns:a="http://schemas.openxmlformats.org/drawingml/2006/main" xmlns:pic="http://schemas.openxmlformats.org/drawingml/2006/picture">
             <wp:extent cx="5580000" cy="754757"/>
-            <wp:docPr id="10" name="Picture 10"/>
+            <wp:docPr id="11" name="Picture 11"/>
             <wp:cNvGraphicFramePr>
               <a:graphicFrameLocks noChangeAspect="1"/>
             </wp:cNvGraphicFramePr>
@@ -2439,7 +2451,7 @@
                     <pic:cNvPicPr/>
                   </pic:nvPicPr>
                   <pic:blipFill>
-                    <a:blip r:embed="rId18"/>
+                    <a:blip r:embed="rId19"/>
                     <a:stretch>
                       <a:fillRect/>
                     </a:stretch>
@@ -2467,7 +2479,7 @@
           <w:i/>
           <w:sz w:val="18"/>
         </w:rPr>
-        <w:t>Figure 10. Screenshot - terminal: end of `docker build -t heart-api:0.2.0 .` and `docker images heart-api`</w:t>
+        <w:t>Figure 11. Screenshot - terminal: end of `docker build -t heart-api:0.2.0 .` and `docker images heart-api`</w:t>
       </w:r>
     </w:p>
     <w:p>
@@ -2478,7 +2490,7 @@
         <w:drawing>
           <wp:inline xmlns:a="http://schemas.openxmlformats.org/drawingml/2006/main" xmlns:pic="http://schemas.openxmlformats.org/drawingml/2006/picture">
             <wp:extent cx="5580000" cy="3248190"/>
-            <wp:docPr id="11" name="Picture 11"/>
+            <wp:docPr id="12" name="Picture 12"/>
             <wp:cNvGraphicFramePr>
               <a:graphicFrameLocks noChangeAspect="1"/>
             </wp:cNvGraphicFramePr>
@@ -2490,7 +2502,7 @@
                     <pic:cNvPicPr/>
                   </pic:nvPicPr>
                   <pic:blipFill>
-                    <a:blip r:embed="rId19"/>
+                    <a:blip r:embed="rId20"/>
                     <a:stretch>
                       <a:fillRect/>
                     </a:stretch>
@@ -2518,7 +2530,7 @@
           <w:i/>
           <w:sz w:val="18"/>
         </w:rPr>
-        <w:t>Figure 11. Screenshot - terminal: `docker run -d -p 8000:8000 heart-api:0.2.0`, then curl /health and curl /predict with samples/sample_request.json</w:t>
+        <w:t>Figure 12. Screenshot - terminal: `docker run -d -p 8000:8000 heart-api:0.2.0`, then curl /health and curl /predict with samples/sample_request.json</w:t>
       </w:r>
     </w:p>
     <w:p>
@@ -2571,7 +2583,7 @@
         <w:drawing>
           <wp:inline xmlns:a="http://schemas.openxmlformats.org/drawingml/2006/main" xmlns:pic="http://schemas.openxmlformats.org/drawingml/2006/picture">
             <wp:extent cx="5580000" cy="1293456"/>
-            <wp:docPr id="12" name="Picture 12"/>
+            <wp:docPr id="13" name="Picture 13"/>
             <wp:cNvGraphicFramePr>
               <a:graphicFrameLocks noChangeAspect="1"/>
             </wp:cNvGraphicFramePr>
@@ -2583,7 +2595,7 @@
                     <pic:cNvPicPr/>
                   </pic:nvPicPr>
                   <pic:blipFill>
-                    <a:blip r:embed="rId20"/>
+                    <a:blip r:embed="rId21"/>
                     <a:stretch>
                       <a:fillRect/>
                     </a:stretch>
@@ -2611,7 +2623,7 @@
           <w:i/>
           <w:sz w:val="18"/>
         </w:rPr>
-        <w:t>Figure 12. Screenshot - terminal: `kubectl get pods,svc,deploy -o wide` showing 2/2 pods Running, the LoadBalancer on 8080 and image 0.2.0</w:t>
+        <w:t>Figure 13. Screenshot - terminal: `kubectl get pods,svc,deploy -o wide` showing 2/2 pods Running, the LoadBalancer on 8080 and image 0.2.0</w:t>
       </w:r>
     </w:p>
     <w:p>
@@ -2622,7 +2634,7 @@
         <w:drawing>
           <wp:inline xmlns:a="http://schemas.openxmlformats.org/drawingml/2006/main" xmlns:pic="http://schemas.openxmlformats.org/drawingml/2006/picture">
             <wp:extent cx="5580000" cy="2903937"/>
-            <wp:docPr id="13" name="Picture 13"/>
+            <wp:docPr id="14" name="Picture 14"/>
             <wp:cNvGraphicFramePr>
               <a:graphicFrameLocks noChangeAspect="1"/>
             </wp:cNvGraphicFramePr>
@@ -2634,7 +2646,7 @@
                     <pic:cNvPicPr/>
                   </pic:nvPicPr>
                   <pic:blipFill>
-                    <a:blip r:embed="rId21"/>
+                    <a:blip r:embed="rId22"/>
                     <a:stretch>
                       <a:fillRect/>
                     </a:stretch>
@@ -2662,7 +2674,7 @@
           <w:i/>
           <w:sz w:val="18"/>
         </w:rPr>
-        <w:t>Figure 13. Screenshot - browser: http://localhost:8080/docs with /predict executed using the sample body and a 200 response</w:t>
+        <w:t>Figure 14. Screenshot - browser: http://localhost:8080/docs with /predict executed using the sample body and a 200 response</w:t>
       </w:r>
     </w:p>
     <w:p>
@@ -2673,7 +2685,7 @@
         <w:drawing>
           <wp:inline xmlns:a="http://schemas.openxmlformats.org/drawingml/2006/main" xmlns:pic="http://schemas.openxmlformats.org/drawingml/2006/picture">
             <wp:extent cx="5580000" cy="2479646"/>
-            <wp:docPr id="14" name="Picture 14"/>
+            <wp:docPr id="15" name="Picture 15"/>
             <wp:cNvGraphicFramePr>
               <a:graphicFrameLocks noChangeAspect="1"/>
             </wp:cNvGraphicFramePr>
@@ -2685,7 +2697,7 @@
                     <pic:cNvPicPr/>
                   </pic:nvPicPr>
                   <pic:blipFill>
-                    <a:blip r:embed="rId22"/>
+                    <a:blip r:embed="rId23"/>
                     <a:stretch>
                       <a:fillRect/>
                     </a:stretch>
@@ -2713,7 +2725,7 @@
           <w:i/>
           <w:sz w:val="18"/>
         </w:rPr>
-        <w:t>Figure 14. Screenshot - Docker Desktop Kubernetes view with the cluster running and the heart-api pods</w:t>
+        <w:t>Figure 15. Screenshot - Docker Desktop Kubernetes view with the cluster running and the heart-api pods</w:t>
       </w:r>
     </w:p>
     <w:p>
@@ -2802,7 +2814,7 @@
         <w:drawing>
           <wp:inline xmlns:a="http://schemas.openxmlformats.org/drawingml/2006/main" xmlns:pic="http://schemas.openxmlformats.org/drawingml/2006/picture">
             <wp:extent cx="5580000" cy="1831536"/>
-            <wp:docPr id="15" name="Picture 15"/>
+            <wp:docPr id="16" name="Picture 16"/>
             <wp:cNvGraphicFramePr>
               <a:graphicFrameLocks noChangeAspect="1"/>
             </wp:cNvGraphicFramePr>
@@ -2814,7 +2826,7 @@
                     <pic:cNvPicPr/>
                   </pic:nvPicPr>
                   <pic:blipFill>
-                    <a:blip r:embed="rId23"/>
+                    <a:blip r:embed="rId24"/>
                     <a:stretch>
                       <a:fillRect/>
                     </a:stretch>
@@ -2842,7 +2854,7 @@
           <w:i/>
           <w:sz w:val="18"/>
         </w:rPr>
-        <w:t>Figure 15. Screenshot - terminal: `kubectl logs -l app.kubernetes.io/name=heart-api --prefix --tail=20` with JSON lines for /predict</w:t>
+        <w:t>Figure 16. Screenshot - terminal: `kubectl logs -l app.kubernetes.io/name=heart-api --prefix --tail=20` with JSON lines for /predict</w:t>
       </w:r>
     </w:p>
     <w:p>
@@ -2853,7 +2865,7 @@
         <w:drawing>
           <wp:inline xmlns:a="http://schemas.openxmlformats.org/drawingml/2006/main" xmlns:pic="http://schemas.openxmlformats.org/drawingml/2006/picture">
             <wp:extent cx="5580000" cy="3436105"/>
-            <wp:docPr id="16" name="Picture 16"/>
+            <wp:docPr id="17" name="Picture 17"/>
             <wp:cNvGraphicFramePr>
               <a:graphicFrameLocks noChangeAspect="1"/>
             </wp:cNvGraphicFramePr>
@@ -2865,7 +2877,7 @@
                     <pic:cNvPicPr/>
                   </pic:nvPicPr>
                   <pic:blipFill>
-                    <a:blip r:embed="rId24"/>
+                    <a:blip r:embed="rId25"/>
                     <a:stretch>
                       <a:fillRect/>
                     </a:stretch>
@@ -2893,7 +2905,7 @@
           <w:i/>
           <w:sz w:val="18"/>
         </w:rPr>
-        <w:t>Figure 16. Screenshot - browser: http://localhost:8080/metrics showing the heart_api_* series</w:t>
+        <w:t>Figure 17. Screenshot - browser: http://localhost:8080/metrics showing the heart_api_* series</w:t>
       </w:r>
     </w:p>
     <w:p>
@@ -2904,7 +2916,7 @@
         <w:drawing>
           <wp:inline xmlns:a="http://schemas.openxmlformats.org/drawingml/2006/main" xmlns:pic="http://schemas.openxmlformats.org/drawingml/2006/picture">
             <wp:extent cx="5580000" cy="2825242"/>
-            <wp:docPr id="17" name="Picture 17"/>
+            <wp:docPr id="18" name="Picture 18"/>
             <wp:cNvGraphicFramePr>
               <a:graphicFrameLocks noChangeAspect="1"/>
             </wp:cNvGraphicFramePr>
@@ -2916,7 +2928,7 @@
                     <pic:cNvPicPr/>
                   </pic:nvPicPr>
                   <pic:blipFill>
-                    <a:blip r:embed="rId25"/>
+                    <a:blip r:embed="rId26"/>
                     <a:stretch>
                       <a:fillRect/>
                     </a:stretch>
@@ -2944,7 +2956,7 @@
           <w:i/>
           <w:sz w:val="18"/>
         </w:rPr>
-        <w:t>Figure 17. Screenshot - browser: http://localhost:9090/targets with the heart-api target UP</w:t>
+        <w:t>Figure 18. Screenshot - browser: http://localhost:9090/targets with the heart-api target UP</w:t>
       </w:r>
     </w:p>
     <w:p>
@@ -2955,7 +2967,7 @@
         <w:drawing>
           <wp:inline xmlns:a="http://schemas.openxmlformats.org/drawingml/2006/main" xmlns:pic="http://schemas.openxmlformats.org/drawingml/2006/picture">
             <wp:extent cx="5580000" cy="2517912"/>
-            <wp:docPr id="18" name="Picture 18"/>
+            <wp:docPr id="19" name="Picture 19"/>
             <wp:cNvGraphicFramePr>
               <a:graphicFrameLocks noChangeAspect="1"/>
             </wp:cNvGraphicFramePr>
@@ -2967,7 +2979,7 @@
                     <pic:cNvPicPr/>
                   </pic:nvPicPr>
                   <pic:blipFill>
-                    <a:blip r:embed="rId26"/>
+                    <a:blip r:embed="rId27"/>
                     <a:stretch>
                       <a:fillRect/>
                     </a:stretch>
@@ -2995,7 +3007,7 @@
           <w:i/>
           <w:sz w:val="18"/>
         </w:rPr>
-        <w:t>Figure 18. Screenshot - browser: Prometheus query `sum by (label) (heart_api_predictions_total)` in graph view</w:t>
+        <w:t>Figure 19. Screenshot - browser: Prometheus query `sum by (label) (heart_api_predictions_total)` in graph view</w:t>
       </w:r>
     </w:p>
     <w:p>
@@ -3006,7 +3018,7 @@
         <w:drawing>
           <wp:inline xmlns:a="http://schemas.openxmlformats.org/drawingml/2006/main" xmlns:pic="http://schemas.openxmlformats.org/drawingml/2006/picture">
             <wp:extent cx="5580000" cy="2754758"/>
-            <wp:docPr id="19" name="Picture 19"/>
+            <wp:docPr id="20" name="Picture 20"/>
             <wp:cNvGraphicFramePr>
               <a:graphicFrameLocks noChangeAspect="1"/>
             </wp:cNvGraphicFramePr>
@@ -3018,7 +3030,7 @@
                     <pic:cNvPicPr/>
                   </pic:nvPicPr>
                   <pic:blipFill>
-                    <a:blip r:embed="rId27"/>
+                    <a:blip r:embed="rId28"/>
                     <a:stretch>
                       <a:fillRect/>
                     </a:stretch>
@@ -3046,7 +3058,7 @@
           <w:i/>
           <w:sz w:val="18"/>
         </w:rPr>
-        <w:t>Figure 19. Screenshot - browser: http://localhost:3000/d/heart-api-ops after a fresh load test, last 15 minutes, all panels populated</w:t>
+        <w:t>Figure 20. Screenshot - browser: http://localhost:3000/d/heart-api-ops after a fresh load test, last 15 minutes, all panels populated</w:t>
       </w:r>
     </w:p>
     <w:p>
@@ -3078,7 +3090,7 @@
         <w:pStyle w:val="ListBullet"/>
       </w:pPr>
       <w:r>
-        <w:t>CI has not yet executed on GitHub, and there is no CD step. Next steps are to push, add an image build-and-push job, and deploy by tag.</w:t>
+        <w:t>There is no CD step yet. Next steps are to add an image build-and-push job and deploy by tag.</w:t>
       </w:r>
     </w:p>
     <w:p>
@@ -3113,7 +3125,7 @@
         <w:t xml:space="preserve">Repository link: </w:t>
       </w:r>
       <w:r>
-        <w:t>&lt;GitHub repository URL - to be added after the first push&gt;</w:t>
+        <w:t>https://github.com/2025ae05879/mlops-heart-disease</w:t>
       </w:r>
     </w:p>
     <w:p>

</xml_diff>